<commit_message>
Replace markdown-heavy Word docs with truly professional formatting
Recreated instructor pack Word documents with:
- Proper formatting (no markdown syntax visible)
- Professional typography and styling
- Color-coded headers (navy blue primary, teal accents)
- Properly formatted tables (session plan, weak spots, assessment)
- Real bullet points and numbered lists (not markdown)
- Clear visual hierarchy and spacing
- Ready to print, share, or upload to LMS

Files:
- Systems_Evaluations_Instructor_Pack_ENHANCED.docx (39KB)
  * Learning objectives, scaffolding strategy, case studies
  * Facilitation notes, exercises, checkpoints, ethics
  * Comprehensive professional pack

- Systems_Evaluations_Instructor_Pack_ORIGINAL.docx (36KB)
  * Teaching brief, session plan, explanation variants
  * Key concepts reference
  * Quick reference version

Both files are now fully professional without any markdown formatting visible.

Co-Authored-By: Claude Haiku 4.5 <noreply@anthropic.com>
</commit_message>
<xml_diff>
--- a/weekly_artifacts/week-20-2026/act_outputs/Systems_Evaluations_Instructor_Pack_ENHANCED.docx
+++ b/weekly_artifacts/week-20-2026/act_outputs/Systems_Evaluations_Instructor_Pack_ENHANCED.docx
@@ -10,7 +10,7 @@
         <w:rPr>
           <w:b/>
           <w:color w:val="1F4E79"/>
-          <w:sz w:val="56"/>
+          <w:sz w:val="64"/>
         </w:rPr>
         <w:t>Systems Evaluations</w:t>
       </w:r>
@@ -21,61 +21,75 @@
       </w:pPr>
       <w:r>
         <w:rPr>
+          <w:b/>
           <w:color w:val="00B0B0"/>
-          <w:sz w:val="28"/>
+          <w:sz w:val="32"/>
         </w:rPr>
         <w:t>Instructor Pack - Enhanced Edition</w:t>
       </w:r>
     </w:p>
     <w:p>
       <w:pPr>
-        <w:spacing w:after="0"/>
+        <w:spacing w:after="240"/>
       </w:pPr>
     </w:p>
     <w:p>
       <w:pPr>
-        <w:spacing w:after="240"/>
+        <w:spacing w:after="280"/>
       </w:pPr>
       <w:r>
         <w:rPr>
-          <w:color w:val="646464"/>
+          <w:i/>
+          <w:color w:val="616161"/>
           <w:sz w:val="20"/>
         </w:rPr>
-        <w:t>Course: Agentic AI | Week 20 | 90 minutes</w:t>
+        <w:t>Agentic AI Course | Week 20 | 90 Minutes</w:t>
         <w:br/>
-        <w:t>Unit ID: unit_systems_evaluations_w20</w:t>
+        <w:t>Unit: unit_systems_evaluations_w20</w:t>
         <w:br/>
-        <w:t>Pedagogical Framework: Scaffolding + TPACK + Project-Based Learning</w:t>
+        <w:t>Framework: Scaffolding + TPACK + Project-Based Learning</w:t>
       </w:r>
     </w:p>
     <w:p>
       <w:pPr>
         <w:pStyle w:val="Heading1"/>
-        <w:spacing w:before="240" w:after="120"/>
+        <w:spacing w:before="240" w:after="160"/>
       </w:pPr>
       <w:r>
-        <w:t>Learning Objectives (SMART)</w:t>
+        <w:rPr>
+          <w:b/>
+          <w:color w:val="1F4E79"/>
+          <w:sz w:val="32"/>
+        </w:rPr>
+        <w:t>Learning Objectives</w:t>
       </w:r>
     </w:p>
     <w:p>
       <w:pPr>
-        <w:pStyle w:val="ListNumber"/>
+        <w:spacing w:after="120"/>
       </w:pPr>
       <w:r>
+        <w:rPr>
+          <w:b w:val="0"/>
+          <w:color w:val="212121"/>
+          <w:sz w:val="22"/>
+        </w:rPr>
         <w:t>By the end of this 90-minute session, learners will:</w:t>
       </w:r>
     </w:p>
     <w:p>
       <w:pPr>
         <w:pStyle w:val="ListNumber"/>
+        <w:spacing w:after="80"/>
       </w:pPr>
       <w:r>
-        <w:t>Define what systems evaluation means (vs testing) and articulate why it matters</w:t>
+        <w:t>Define systems evaluation (vs testing) and articulate why it matters for production AI</w:t>
       </w:r>
     </w:p>
     <w:p>
       <w:pPr>
         <w:pStyle w:val="ListNumber"/>
+        <w:spacing w:after="80"/>
       </w:pPr>
       <w:r>
         <w:t>Design a 3-5 metric evaluation framework for a specific agent use case</w:t>
@@ -84,14 +98,16 @@
     <w:p>
       <w:pPr>
         <w:pStyle w:val="ListNumber"/>
+        <w:spacing w:after="80"/>
       </w:pPr>
       <w:r>
-        <w:t>Build a hybrid evaluation suite combining automated checks + human review</w:t>
+        <w:t>Build a hybrid evaluation suite combining automated checks and human review</w:t>
       </w:r>
     </w:p>
     <w:p>
       <w:pPr>
         <w:pStyle w:val="ListNumber"/>
+        <w:spacing w:after="80"/>
       </w:pPr>
       <w:r>
         <w:t>Apply scaffolded thinking: start with human judgment, then derive metrics</w:t>
@@ -100,27 +116,38 @@
     <w:p>
       <w:pPr>
         <w:pStyle w:val="ListNumber"/>
+        <w:spacing w:after="80"/>
       </w:pPr>
       <w:r>
-        <w:t>Reflect on ethical dimensions: bias, fairness, and documentation</w:t>
+        <w:t>Reflect on ethical dimensions: bias, fairness, and documentation in evaluation</w:t>
       </w:r>
     </w:p>
     <w:p/>
     <w:p>
       <w:pPr>
         <w:pStyle w:val="Heading1"/>
-        <w:spacing w:before="240" w:after="120"/>
+        <w:spacing w:before="240" w:after="160"/>
       </w:pPr>
       <w:r>
+        <w:rPr>
+          <w:b/>
+          <w:color w:val="1F4E79"/>
+          <w:sz w:val="32"/>
+        </w:rPr>
         <w:t>Teaching Brief</w:t>
       </w:r>
     </w:p>
     <w:p>
       <w:pPr>
         <w:pStyle w:val="Heading2"/>
-        <w:spacing w:before="200" w:after="80"/>
+        <w:spacing w:before="200" w:after="120"/>
       </w:pPr>
       <w:r>
+        <w:rPr>
+          <w:b/>
+          <w:color w:val="00B0B0"/>
+          <w:sz w:val="26"/>
+        </w:rPr>
         <w:t>What Learners Already Know</w:t>
       </w:r>
     </w:p>
@@ -153,7 +180,7 @@
         <w:pStyle w:val="ListBullet"/>
       </w:pPr>
       <w:r>
-        <w:t>Python and testing frameworks basics</w:t>
+        <w:t>Python and testing frameworks</w:t>
       </w:r>
     </w:p>
     <w:p>
@@ -168,10 +195,15 @@
     <w:p>
       <w:pPr>
         <w:pStyle w:val="Heading2"/>
-        <w:spacing w:before="200" w:after="80"/>
+        <w:spacing w:before="200" w:after="120"/>
       </w:pPr>
       <w:r>
-        <w:t>Key Weak Spots to Monitor</w:t>
+        <w:rPr>
+          <w:b/>
+          <w:color w:val="00B0B0"/>
+          <w:sz w:val="26"/>
+        </w:rPr>
+        <w:t>Critical Weak Spots to Monitor</w:t>
       </w:r>
     </w:p>
     <w:tbl>
@@ -181,20 +213,22 @@
         <w:tblLook w:firstColumn="1" w:firstRow="1" w:lastColumn="0" w:lastRow="0" w:noHBand="0" w:noVBand="1" w:val="04A0"/>
       </w:tblPr>
       <w:tblGrid>
-        <w:gridCol w:w="2160"/>
-        <w:gridCol w:w="2160"/>
-        <w:gridCol w:w="2160"/>
-        <w:gridCol w:w="2160"/>
+        <w:gridCol w:w="2520"/>
+        <w:gridCol w:w="2520"/>
+        <w:gridCol w:w="2520"/>
+        <w:gridCol w:w="2520"/>
       </w:tblGrid>
       <w:tr>
         <w:tc>
           <w:tcPr>
-            <w:tcW w:type="dxa" w:w="2160"/>
+            <w:tcW w:type="dxa" w:w="2520"/>
+            <w:shd w:fill="1F4E79"/>
           </w:tcPr>
           <w:p>
             <w:r>
               <w:rPr>
                 <w:b/>
+                <w:color w:val="FFFFFF"/>
               </w:rPr>
               <w:t>Issue</w:t>
             </w:r>
@@ -202,12 +236,14 @@
         </w:tc>
         <w:tc>
           <w:tcPr>
-            <w:tcW w:type="dxa" w:w="2160"/>
+            <w:tcW w:type="dxa" w:w="2520"/>
+            <w:shd w:fill="1F4E79"/>
           </w:tcPr>
           <w:p>
             <w:r>
               <w:rPr>
                 <w:b/>
+                <w:color w:val="FFFFFF"/>
               </w:rPr>
               <w:t>Why It Happens</w:t>
             </w:r>
@@ -215,12 +251,14 @@
         </w:tc>
         <w:tc>
           <w:tcPr>
-            <w:tcW w:type="dxa" w:w="2160"/>
+            <w:tcW w:type="dxa" w:w="2520"/>
+            <w:shd w:fill="1F4E79"/>
           </w:tcPr>
           <w:p>
             <w:r>
               <w:rPr>
                 <w:b/>
+                <w:color w:val="FFFFFF"/>
               </w:rPr>
               <w:t>What To Do</w:t>
             </w:r>
@@ -228,14 +266,16 @@
         </w:tc>
         <w:tc>
           <w:tcPr>
-            <w:tcW w:type="dxa" w:w="2160"/>
+            <w:tcW w:type="dxa" w:w="2520"/>
+            <w:shd w:fill="1F4E79"/>
           </w:tcPr>
           <w:p>
             <w:r>
               <w:rPr>
                 <w:b/>
+                <w:color w:val="FFFFFF"/>
               </w:rPr>
-              <w:t>Signal to Watch</w:t>
+              <w:t>Red Flag Signal</w:t>
             </w:r>
           </w:p>
         </w:tc>
@@ -243,40 +283,52 @@
       <w:tr>
         <w:tc>
           <w:tcPr>
-            <w:tcW w:type="dxa" w:w="2160"/>
+            <w:tcW w:type="dxa" w:w="2520"/>
           </w:tcPr>
           <w:p>
             <w:r>
+              <w:rPr>
+                <w:sz w:val="20"/>
+              </w:rPr>
               <w:t>Confusing evaluation with testing</w:t>
             </w:r>
           </w:p>
         </w:tc>
         <w:tc>
           <w:tcPr>
-            <w:tcW w:type="dxa" w:w="2160"/>
+            <w:tcW w:type="dxa" w:w="2520"/>
           </w:tcPr>
           <w:p>
             <w:r>
-              <w:t>Mental model: testing = unit tests</w:t>
+              <w:rPr>
+                <w:sz w:val="20"/>
+              </w:rPr>
+              <w:t>They think testing = unit tests</w:t>
             </w:r>
           </w:p>
         </w:tc>
         <w:tc>
           <w:tcPr>
-            <w:tcW w:type="dxa" w:w="2160"/>
+            <w:tcW w:type="dxa" w:w="2520"/>
           </w:tcPr>
           <w:p>
             <w:r>
-              <w:t>Use Quality Control analogy. Show: testing checks code; evaluation checks value</w:t>
+              <w:rPr>
+                <w:sz w:val="20"/>
+              </w:rPr>
+              <w:t>Use Quality Control analogy. Testing checks code; evaluation checks value</w:t>
             </w:r>
           </w:p>
         </w:tc>
         <w:tc>
           <w:tcPr>
-            <w:tcW w:type="dxa" w:w="2160"/>
+            <w:tcW w:type="dxa" w:w="2520"/>
           </w:tcPr>
           <w:p>
             <w:r>
+              <w:rPr>
+                <w:sz w:val="20"/>
+              </w:rPr>
               <w:t>They ask 'Is this a test?' when you say evaluation</w:t>
             </w:r>
           </w:p>
@@ -285,40 +337,52 @@
       <w:tr>
         <w:tc>
           <w:tcPr>
-            <w:tcW w:type="dxa" w:w="2160"/>
+            <w:tcW w:type="dxa" w:w="2520"/>
           </w:tcPr>
           <w:p>
             <w:r>
+              <w:rPr>
+                <w:sz w:val="20"/>
+              </w:rPr>
               <w:t>Metric overload</w:t>
             </w:r>
           </w:p>
         </w:tc>
         <w:tc>
           <w:tcPr>
-            <w:tcW w:type="dxa" w:w="2160"/>
+            <w:tcW w:type="dxa" w:w="2520"/>
           </w:tcPr>
           <w:p>
             <w:r>
-              <w:t>Fear of missing something</w:t>
+              <w:rPr>
+                <w:sz w:val="20"/>
+              </w:rPr>
+              <w:t>Fear of missing visibility</w:t>
             </w:r>
           </w:p>
         </w:tc>
         <w:tc>
           <w:tcPr>
-            <w:tcW w:type="dxa" w:w="2160"/>
+            <w:tcW w:type="dxa" w:w="2520"/>
           </w:tcPr>
           <w:p>
             <w:r>
-              <w:t>Say 'Pick 3-5 that matter for THIS system'</w:t>
+              <w:rPr>
+                <w:sz w:val="20"/>
+              </w:rPr>
+              <w:t>Say: Pick 3-5 that matter for THIS system. Ignore the rest.</w:t>
             </w:r>
           </w:p>
         </w:tc>
         <w:tc>
           <w:tcPr>
-            <w:tcW w:type="dxa" w:w="2160"/>
+            <w:tcW w:type="dxa" w:w="2520"/>
           </w:tcPr>
           <w:p>
             <w:r>
+              <w:rPr>
+                <w:sz w:val="20"/>
+              </w:rPr>
               <w:t>They want to track everything</w:t>
             </w:r>
           </w:p>
@@ -327,41 +391,53 @@
       <w:tr>
         <w:tc>
           <w:tcPr>
-            <w:tcW w:type="dxa" w:w="2160"/>
+            <w:tcW w:type="dxa" w:w="2520"/>
           </w:tcPr>
           <w:p>
             <w:r>
+              <w:rPr>
+                <w:sz w:val="20"/>
+              </w:rPr>
               <w:t>Not knowing where to start</w:t>
             </w:r>
           </w:p>
         </w:tc>
         <w:tc>
           <w:tcPr>
-            <w:tcW w:type="dxa" w:w="2160"/>
+            <w:tcW w:type="dxa" w:w="2520"/>
           </w:tcPr>
           <w:p>
             <w:r>
-              <w:t>No mental model for evaluation design</w:t>
+              <w:rPr>
+                <w:sz w:val="20"/>
+              </w:rPr>
+              <w:t>No mental model for design</w:t>
             </w:r>
           </w:p>
         </w:tc>
         <w:tc>
           <w:tcPr>
-            <w:tcW w:type="dxa" w:w="2160"/>
+            <w:tcW w:type="dxa" w:w="2520"/>
           </w:tcPr>
           <w:p>
             <w:r>
-              <w:t>Start with human eval first, then derive metrics</w:t>
+              <w:rPr>
+                <w:sz w:val="20"/>
+              </w:rPr>
+              <w:t>Start with human eval first. Then derive metrics from that.</w:t>
             </w:r>
           </w:p>
         </w:tc>
         <w:tc>
           <w:tcPr>
-            <w:tcW w:type="dxa" w:w="2160"/>
+            <w:tcW w:type="dxa" w:w="2520"/>
           </w:tcPr>
           <w:p>
             <w:r>
-              <w:t>They ask 'What metrics?' before knowing what good looks like</w:t>
+              <w:rPr>
+                <w:sz w:val="20"/>
+              </w:rPr>
+              <w:t>They ask 'What metrics?' before defining what good looks like</w:t>
             </w:r>
           </w:p>
         </w:tc>
@@ -369,41 +445,53 @@
       <w:tr>
         <w:tc>
           <w:tcPr>
-            <w:tcW w:type="dxa" w:w="2160"/>
+            <w:tcW w:type="dxa" w:w="2520"/>
           </w:tcPr>
           <w:p>
             <w:r>
+              <w:rPr>
+                <w:sz w:val="20"/>
+              </w:rPr>
               <w:t>Treating evaluation as one-time</w:t>
             </w:r>
           </w:p>
         </w:tc>
         <w:tc>
           <w:tcPr>
-            <w:tcW w:type="dxa" w:w="2160"/>
+            <w:tcW w:type="dxa" w:w="2520"/>
           </w:tcPr>
           <w:p>
             <w:r>
+              <w:rPr>
+                <w:sz w:val="20"/>
+              </w:rPr>
               <w:t>Waterfall thinking</w:t>
             </w:r>
           </w:p>
         </w:tc>
         <w:tc>
           <w:tcPr>
-            <w:tcW w:type="dxa" w:w="2160"/>
+            <w:tcW w:type="dxa" w:w="2520"/>
           </w:tcPr>
           <w:p>
             <w:r>
-              <w:t>Emphasize continuous loop: measure → improve → measure</w:t>
+              <w:rPr>
+                <w:sz w:val="20"/>
+              </w:rPr>
+              <w:t>Emphasize continuous: measure → improve → measure again</w:t>
             </w:r>
           </w:p>
         </w:tc>
         <w:tc>
           <w:tcPr>
-            <w:tcW w:type="dxa" w:w="2160"/>
+            <w:tcW w:type="dxa" w:w="2520"/>
           </w:tcPr>
           <w:p>
             <w:r>
-              <w:t>They ask 'When do we evaluate?' expecting single answer</w:t>
+              <w:rPr>
+                <w:sz w:val="20"/>
+              </w:rPr>
+              <w:t>They expect a single evaluation moment</w:t>
             </w:r>
           </w:p>
         </w:tc>
@@ -411,41 +499,53 @@
       <w:tr>
         <w:tc>
           <w:tcPr>
-            <w:tcW w:type="dxa" w:w="2160"/>
+            <w:tcW w:type="dxa" w:w="2520"/>
           </w:tcPr>
           <w:p>
             <w:r>
+              <w:rPr>
+                <w:sz w:val="20"/>
+              </w:rPr>
               <w:t>Assuming all agents are the same</w:t>
             </w:r>
           </w:p>
         </w:tc>
         <w:tc>
           <w:tcPr>
-            <w:tcW w:type="dxa" w:w="2160"/>
+            <w:tcW w:type="dxa" w:w="2520"/>
           </w:tcPr>
           <w:p>
             <w:r>
-              <w:t>Generic metric thinking</w:t>
+              <w:rPr>
+                <w:sz w:val="20"/>
+              </w:rPr>
+              <w:t>Generic thinking</w:t>
             </w:r>
           </w:p>
         </w:tc>
         <w:tc>
           <w:tcPr>
-            <w:tcW w:type="dxa" w:w="2160"/>
+            <w:tcW w:type="dxa" w:w="2520"/>
           </w:tcPr>
           <w:p>
             <w:r>
-              <w:t>Explicit: Design for YOUR system, not generic</w:t>
+              <w:rPr>
+                <w:sz w:val="20"/>
+              </w:rPr>
+              <w:t>Explicit: Design for YOUR system, not off-the-shelf</w:t>
             </w:r>
           </w:p>
         </w:tc>
         <w:tc>
           <w:tcPr>
-            <w:tcW w:type="dxa" w:w="2160"/>
+            <w:tcW w:type="dxa" w:w="2520"/>
           </w:tcPr>
           <w:p>
             <w:r>
-              <w:t>They try to apply checklist metrics to new domains</w:t>
+              <w:rPr>
+                <w:sz w:val="20"/>
+              </w:rPr>
+              <w:t>They apply checklist metrics to everything</w:t>
             </w:r>
           </w:p>
         </w:tc>
@@ -455,9 +555,14 @@
     <w:p>
       <w:pPr>
         <w:pStyle w:val="Heading1"/>
-        <w:spacing w:before="240" w:after="120"/>
+        <w:spacing w:before="240" w:after="160"/>
       </w:pPr>
       <w:r>
+        <w:rPr>
+          <w:b/>
+          <w:color w:val="1F4E79"/>
+          <w:sz w:val="32"/>
+        </w:rPr>
         <w:t>Session Plan (90 Minutes)</w:t>
       </w:r>
     </w:p>
@@ -468,19 +573,22 @@
         <w:tblLook w:firstColumn="1" w:firstRow="1" w:lastColumn="0" w:lastRow="0" w:noHBand="0" w:noVBand="1" w:val="04A0"/>
       </w:tblPr>
       <w:tblGrid>
-        <w:gridCol w:w="2880"/>
-        <w:gridCol w:w="2880"/>
-        <w:gridCol w:w="2880"/>
+        <w:gridCol w:w="2520"/>
+        <w:gridCol w:w="2520"/>
+        <w:gridCol w:w="2520"/>
+        <w:gridCol w:w="2520"/>
       </w:tblGrid>
       <w:tr>
         <w:tc>
           <w:tcPr>
-            <w:tcW w:type="dxa" w:w="2880"/>
+            <w:tcW w:type="dxa" w:w="2520"/>
+            <w:shd w:fill="00B0B0"/>
           </w:tcPr>
           <w:p>
             <w:r>
               <w:rPr>
                 <w:b/>
+                <w:color w:val="FFFFFF"/>
               </w:rPr>
               <w:t>Time</w:t>
             </w:r>
@@ -488,12 +596,14 @@
         </w:tc>
         <w:tc>
           <w:tcPr>
-            <w:tcW w:type="dxa" w:w="2880"/>
+            <w:tcW w:type="dxa" w:w="2520"/>
+            <w:shd w:fill="00B0B0"/>
           </w:tcPr>
           <w:p>
             <w:r>
               <w:rPr>
                 <w:b/>
+                <w:color w:val="FFFFFF"/>
               </w:rPr>
               <w:t>Block</w:t>
             </w:r>
@@ -501,14 +611,31 @@
         </w:tc>
         <w:tc>
           <w:tcPr>
-            <w:tcW w:type="dxa" w:w="2880"/>
+            <w:tcW w:type="dxa" w:w="2520"/>
+            <w:shd w:fill="00B0B0"/>
           </w:tcPr>
           <w:p>
             <w:r>
               <w:rPr>
                 <w:b/>
+                <w:color w:val="FFFFFF"/>
               </w:rPr>
               <w:t>Activity</w:t>
+            </w:r>
+          </w:p>
+        </w:tc>
+        <w:tc>
+          <w:tcPr>
+            <w:tcW w:type="dxa" w:w="2520"/>
+            <w:shd w:fill="00B0B0"/>
+          </w:tcPr>
+          <w:p>
+            <w:r>
+              <w:rPr>
+                <w:b/>
+                <w:color w:val="FFFFFF"/>
+              </w:rPr>
+              <w:t>Purpose</w:t>
             </w:r>
           </w:p>
         </w:tc>
@@ -516,31 +643,53 @@
       <w:tr>
         <w:tc>
           <w:tcPr>
-            <w:tcW w:type="dxa" w:w="2880"/>
+            <w:tcW w:type="dxa" w:w="2520"/>
           </w:tcPr>
           <w:p>
             <w:r>
+              <w:rPr>
+                <w:sz w:val="20"/>
+              </w:rPr>
               <w:t>0:00–0:10</w:t>
             </w:r>
           </w:p>
         </w:tc>
         <w:tc>
           <w:tcPr>
-            <w:tcW w:type="dxa" w:w="2880"/>
+            <w:tcW w:type="dxa" w:w="2520"/>
           </w:tcPr>
           <w:p>
             <w:r>
+              <w:rPr>
+                <w:sz w:val="20"/>
+              </w:rPr>
               <w:t>Warm-up</w:t>
             </w:r>
           </w:p>
         </w:tc>
         <w:tc>
           <w:tcPr>
-            <w:tcW w:type="dxa" w:w="2880"/>
+            <w:tcW w:type="dxa" w:w="2520"/>
           </w:tcPr>
           <w:p>
             <w:r>
-              <w:t>Show agent output. Ask: Is this good? How do you know?</w:t>
+              <w:rPr>
+                <w:sz w:val="20"/>
+              </w:rPr>
+              <w:t>Show agent output. Ask: Is this good?</w:t>
+            </w:r>
+          </w:p>
+        </w:tc>
+        <w:tc>
+          <w:tcPr>
+            <w:tcW w:type="dxa" w:w="2520"/>
+          </w:tcPr>
+          <w:p>
+            <w:r>
+              <w:rPr>
+                <w:sz w:val="20"/>
+              </w:rPr>
+              <w:t>Surface misconceptions</w:t>
             </w:r>
           </w:p>
         </w:tc>
@@ -548,31 +697,53 @@
       <w:tr>
         <w:tc>
           <w:tcPr>
-            <w:tcW w:type="dxa" w:w="2880"/>
+            <w:tcW w:type="dxa" w:w="2520"/>
           </w:tcPr>
           <w:p>
             <w:r>
+              <w:rPr>
+                <w:sz w:val="20"/>
+              </w:rPr>
               <w:t>0:10–0:25</w:t>
             </w:r>
           </w:p>
         </w:tc>
         <w:tc>
           <w:tcPr>
-            <w:tcW w:type="dxa" w:w="2880"/>
+            <w:tcW w:type="dxa" w:w="2520"/>
           </w:tcPr>
           <w:p>
             <w:r>
-              <w:t>Concept: Evaluation Framework</w:t>
+              <w:rPr>
+                <w:sz w:val="20"/>
+              </w:rPr>
+              <w:t>Concept 1</w:t>
             </w:r>
           </w:p>
         </w:tc>
         <w:tc>
           <w:tcPr>
-            <w:tcW w:type="dxa" w:w="2880"/>
+            <w:tcW w:type="dxa" w:w="2520"/>
           </w:tcPr>
           <w:p>
             <w:r>
-              <w:t>MEASURE loop + why it matters</w:t>
+              <w:rPr>
+                <w:sz w:val="20"/>
+              </w:rPr>
+              <w:t>What is Evaluation? MEASURE Loop</w:t>
+            </w:r>
+          </w:p>
+        </w:tc>
+        <w:tc>
+          <w:tcPr>
+            <w:tcW w:type="dxa" w:w="2520"/>
+          </w:tcPr>
+          <w:p>
+            <w:r>
+              <w:rPr>
+                <w:sz w:val="20"/>
+              </w:rPr>
+              <w:t>Build mental model</w:t>
             </w:r>
           </w:p>
         </w:tc>
@@ -580,31 +751,53 @@
       <w:tr>
         <w:tc>
           <w:tcPr>
-            <w:tcW w:type="dxa" w:w="2880"/>
+            <w:tcW w:type="dxa" w:w="2520"/>
           </w:tcPr>
           <w:p>
             <w:r>
+              <w:rPr>
+                <w:sz w:val="20"/>
+              </w:rPr>
               <w:t>0:25–0:40</w:t>
             </w:r>
           </w:p>
         </w:tc>
         <w:tc>
           <w:tcPr>
-            <w:tcW w:type="dxa" w:w="2880"/>
+            <w:tcW w:type="dxa" w:w="2520"/>
           </w:tcPr>
           <w:p>
             <w:r>
-              <w:t>Concept: Types of Evaluation</w:t>
+              <w:rPr>
+                <w:sz w:val="20"/>
+              </w:rPr>
+              <w:t>Concept 2</w:t>
             </w:r>
           </w:p>
         </w:tc>
         <w:tc>
           <w:tcPr>
-            <w:tcW w:type="dxa" w:w="2880"/>
+            <w:tcW w:type="dxa" w:w="2520"/>
           </w:tcPr>
           <w:p>
             <w:r>
-              <w:t>Automated checks, metrics, human eval</w:t>
+              <w:rPr>
+                <w:sz w:val="20"/>
+              </w:rPr>
+              <w:t>Types of Evaluation (Automated, Manual, Hybrid)</w:t>
+            </w:r>
+          </w:p>
+        </w:tc>
+        <w:tc>
+          <w:tcPr>
+            <w:tcW w:type="dxa" w:w="2520"/>
+          </w:tcPr>
+          <w:p>
+            <w:r>
+              <w:rPr>
+                <w:sz w:val="20"/>
+              </w:rPr>
+              <w:t>Establish tradeoffs</w:t>
             </w:r>
           </w:p>
         </w:tc>
@@ -612,31 +805,53 @@
       <w:tr>
         <w:tc>
           <w:tcPr>
-            <w:tcW w:type="dxa" w:w="2880"/>
+            <w:tcW w:type="dxa" w:w="2520"/>
           </w:tcPr>
           <w:p>
             <w:r>
+              <w:rPr>
+                <w:sz w:val="20"/>
+              </w:rPr>
               <w:t>0:40–0:65</w:t>
             </w:r>
           </w:p>
         </w:tc>
         <w:tc>
           <w:tcPr>
-            <w:tcW w:type="dxa" w:w="2880"/>
+            <w:tcW w:type="dxa" w:w="2520"/>
           </w:tcPr>
           <w:p>
             <w:r>
+              <w:rPr>
+                <w:sz w:val="20"/>
+              </w:rPr>
               <w:t>Live Build</w:t>
             </w:r>
           </w:p>
         </w:tc>
         <w:tc>
           <w:tcPr>
-            <w:tcW w:type="dxa" w:w="2880"/>
+            <w:tcW w:type="dxa" w:w="2520"/>
           </w:tcPr>
           <w:p>
             <w:r>
-              <w:t>Code 3 evaluators (model + guidance)</w:t>
+              <w:rPr>
+                <w:sz w:val="20"/>
+              </w:rPr>
+              <w:t>Code 3 evaluators live (narrate thinking)</w:t>
+            </w:r>
+          </w:p>
+        </w:tc>
+        <w:tc>
+          <w:tcPr>
+            <w:tcW w:type="dxa" w:w="2520"/>
+          </w:tcPr>
+          <w:p>
+            <w:r>
+              <w:rPr>
+                <w:sz w:val="20"/>
+              </w:rPr>
+              <w:t>Model procedural knowledge</w:t>
             </w:r>
           </w:p>
         </w:tc>
@@ -644,31 +859,53 @@
       <w:tr>
         <w:tc>
           <w:tcPr>
-            <w:tcW w:type="dxa" w:w="2880"/>
+            <w:tcW w:type="dxa" w:w="2520"/>
           </w:tcPr>
           <w:p>
             <w:r>
+              <w:rPr>
+                <w:sz w:val="20"/>
+              </w:rPr>
               <w:t>0:65–0:80</w:t>
             </w:r>
           </w:p>
         </w:tc>
         <w:tc>
           <w:tcPr>
-            <w:tcW w:type="dxa" w:w="2880"/>
+            <w:tcW w:type="dxa" w:w="2520"/>
           </w:tcPr>
           <w:p>
             <w:r>
+              <w:rPr>
+                <w:sz w:val="20"/>
+              </w:rPr>
               <w:t>Exercise</w:t>
             </w:r>
           </w:p>
         </w:tc>
         <w:tc>
           <w:tcPr>
-            <w:tcW w:type="dxa" w:w="2880"/>
+            <w:tcW w:type="dxa" w:w="2520"/>
           </w:tcPr>
           <w:p>
             <w:r>
-              <w:t>Design rubric + checks + metrics for scenario</w:t>
+              <w:rPr>
+                <w:sz w:val="20"/>
+              </w:rPr>
+              <w:t>Design rubric + checks + metrics (pairs)</w:t>
+            </w:r>
+          </w:p>
+        </w:tc>
+        <w:tc>
+          <w:tcPr>
+            <w:tcW w:type="dxa" w:w="2520"/>
+          </w:tcPr>
+          <w:p>
+            <w:r>
+              <w:rPr>
+                <w:sz w:val="20"/>
+              </w:rPr>
+              <w:t>Guided practice with support</w:t>
             </w:r>
           </w:p>
         </w:tc>
@@ -676,31 +913,53 @@
       <w:tr>
         <w:tc>
           <w:tcPr>
-            <w:tcW w:type="dxa" w:w="2880"/>
+            <w:tcW w:type="dxa" w:w="2520"/>
           </w:tcPr>
           <w:p>
             <w:r>
+              <w:rPr>
+                <w:sz w:val="20"/>
+              </w:rPr>
               <w:t>0:80–0:90</w:t>
             </w:r>
           </w:p>
         </w:tc>
         <w:tc>
           <w:tcPr>
-            <w:tcW w:type="dxa" w:w="2880"/>
+            <w:tcW w:type="dxa" w:w="2520"/>
           </w:tcPr>
           <w:p>
             <w:r>
-              <w:t>Reflect &amp; Close</w:t>
+              <w:rPr>
+                <w:sz w:val="20"/>
+              </w:rPr>
+              <w:t>Reflect</w:t>
             </w:r>
           </w:p>
         </w:tc>
         <w:tc>
           <w:tcPr>
-            <w:tcW w:type="dxa" w:w="2880"/>
+            <w:tcW w:type="dxa" w:w="2520"/>
           </w:tcPr>
           <w:p>
             <w:r>
-              <w:t>How do you know when your agent is good?</w:t>
+              <w:rPr>
+                <w:sz w:val="20"/>
+              </w:rPr>
+              <w:t>How do you know agent is good? Discussion</w:t>
+            </w:r>
+          </w:p>
+        </w:tc>
+        <w:tc>
+          <w:tcPr>
+            <w:tcW w:type="dxa" w:w="2520"/>
+          </w:tcPr>
+          <w:p>
+            <w:r>
+              <w:rPr>
+                <w:sz w:val="20"/>
+              </w:rPr>
+              <w:t>Metacognition + iteration mindset</w:t>
             </w:r>
           </w:p>
         </w:tc>
@@ -710,25 +969,466 @@
     <w:p>
       <w:pPr>
         <w:pStyle w:val="Heading1"/>
-        <w:spacing w:before="240" w:after="120"/>
+        <w:spacing w:before="240" w:after="160"/>
       </w:pPr>
       <w:r>
+        <w:rPr>
+          <w:b/>
+          <w:color w:val="1F4E79"/>
+          <w:sz w:val="32"/>
+        </w:rPr>
         <w:t>Explanation Variants (Multiple Entry Points)</w:t>
       </w:r>
     </w:p>
     <w:p>
       <w:pPr>
         <w:pStyle w:val="Heading2"/>
-        <w:spacing w:before="200" w:after="80"/>
+        <w:spacing w:before="200" w:after="120"/>
       </w:pPr>
       <w:r>
+        <w:rPr>
+          <w:b/>
+          <w:color w:val="00B0B0"/>
+          <w:sz w:val="26"/>
+        </w:rPr>
         <w:t>Concept 1: What is Systems Evaluation?</w:t>
       </w:r>
     </w:p>
     <w:p>
       <w:pPr>
         <w:spacing w:after="160"/>
-        <w:ind w:left="432"/>
+      </w:pPr>
+      <w:r>
+        <w:rPr>
+          <w:b/>
+          <w:color w:val="1F4E79"/>
+        </w:rPr>
+        <w:t>VARIANT A: Quality Control Analogy (START HERE)</w:t>
+      </w:r>
+      <w:r>
+        <w:br/>
+        <w:t>Systems evaluation is to agents what quality control is to factories. You build a product, then ask: Does it work? Does it meet standards? What breaks? Why it works: Concrete, relatable, grounds abstract concept in physical world.</w:t>
+      </w:r>
+    </w:p>
+    <w:p>
+      <w:pPr>
+        <w:spacing w:after="160"/>
+      </w:pPr>
+      <w:r>
+        <w:rPr>
+          <w:b/>
+          <w:color w:val="1F4E79"/>
+        </w:rPr>
+        <w:t>VARIANT B: Problem-First</w:t>
+      </w:r>
+      <w:r>
+        <w:br/>
+        <w:t>You've built an agent. But how do you know it's good? Evaluation answers: Does it generate quality materials? Does it publish without errors? Does it handle edge cases? Why it works: Addresses pain point. Shows relevance. Practical, not theoretical.</w:t>
+      </w:r>
+    </w:p>
+    <w:p>
+      <w:pPr>
+        <w:spacing w:after="160"/>
+      </w:pPr>
+      <w:r>
+        <w:rPr>
+          <w:b/>
+          <w:color w:val="1F4E79"/>
+        </w:rPr>
+        <w:t>VARIANT C: Code-First</w:t>
+      </w:r>
+      <w:r>
+        <w:br/>
+        <w:t>Evaluation is a layer on your agent. Capture inputs → run → measure quality → iterate. Measure → find problems → improve → measure. Why it works: Maps to engineering mindset. Emphasizes feedback loops.</w:t>
+      </w:r>
+    </w:p>
+    <w:p>
+      <w:pPr>
+        <w:spacing w:after="160"/>
+      </w:pPr>
+      <w:r>
+        <w:rPr>
+          <w:b/>
+          <w:color w:val="1F4E79"/>
+        </w:rPr>
+        <w:t>VARIANT D: Ethical Angle</w:t>
+      </w:r>
+      <w:r>
+        <w:br/>
+        <w:t>When you ship an agent, you're responsible. Evaluation means: Is it accurate? Fair? Can you explain decisions? Why it works: Connects to values. Shows evaluation as responsibility, not checkbox.</w:t>
+      </w:r>
+    </w:p>
+    <w:p/>
+    <w:p>
+      <w:pPr>
+        <w:pStyle w:val="Heading1"/>
+        <w:spacing w:before="240" w:after="160"/>
+      </w:pPr>
+      <w:r>
+        <w:rPr>
+          <w:b/>
+          <w:color w:val="1F4E79"/>
+          <w:sz w:val="32"/>
+        </w:rPr>
+        <w:t>Facilitation Notes</w:t>
+      </w:r>
+    </w:p>
+    <w:p>
+      <w:pPr>
+        <w:pStyle w:val="Heading2"/>
+        <w:spacing w:before="200" w:after="120"/>
+      </w:pPr>
+      <w:r>
+        <w:rPr>
+          <w:b/>
+          <w:color w:val="00B0B0"/>
+          <w:sz w:val="26"/>
+        </w:rPr>
+        <w:t>Warm-up (0:00-0:10)</w:t>
+      </w:r>
+    </w:p>
+    <w:p>
+      <w:pPr>
+        <w:pStyle w:val="ListNumber"/>
+      </w:pPr>
+      <w:r>
+        <w:t>Show a real agent response on screen</w:t>
+      </w:r>
+    </w:p>
+    <w:p>
+      <w:pPr>
+        <w:pStyle w:val="ListNumber"/>
+      </w:pPr>
+      <w:r>
+        <w:t>Ask: 'Is this good? Rate it 1-5' (force criteria definition)</w:t>
+      </w:r>
+    </w:p>
+    <w:p>
+      <w:pPr>
+        <w:pStyle w:val="ListNumber"/>
+      </w:pPr>
+      <w:r>
+        <w:t>Listen: Don't correct. Let them name what makes it good</w:t>
+      </w:r>
+    </w:p>
+    <w:p>
+      <w:pPr>
+        <w:pStyle w:val="ListNumber"/>
+      </w:pPr>
+      <w:r>
+        <w:t>Synthesize: 'You said accurate, concise, complete. Those are metrics.'</w:t>
+      </w:r>
+    </w:p>
+    <w:p>
+      <w:pPr>
+        <w:pStyle w:val="ListNumber"/>
+      </w:pPr>
+      <w:r>
+        <w:t>Insight: 'We just did evaluation. Now let's formalize it.'</w:t>
+      </w:r>
+    </w:p>
+    <w:p>
+      <w:pPr>
+        <w:spacing w:after="120"/>
+      </w:pPr>
+      <w:r>
+        <w:rPr>
+          <w:b w:val="0"/>
+          <w:color w:val="212121"/>
+          <w:sz w:val="22"/>
+        </w:rPr>
+        <w:t>If they struggle: 'Imagine you're a learner. Would you understand this output?'</w:t>
+      </w:r>
+    </w:p>
+    <w:p/>
+    <w:p>
+      <w:pPr>
+        <w:pStyle w:val="Heading1"/>
+        <w:spacing w:before="240" w:after="160"/>
+      </w:pPr>
+      <w:r>
+        <w:rPr>
+          <w:b/>
+          <w:color w:val="1F4E79"/>
+          <w:sz w:val="32"/>
+        </w:rPr>
+        <w:t>Hands-On Exercise (0:65-0:80)</w:t>
+      </w:r>
+    </w:p>
+    <w:p>
+      <w:pPr>
+        <w:spacing w:after="120"/>
+      </w:pPr>
+      <w:r>
+        <w:rPr>
+          <w:b/>
+          <w:color w:val="212121"/>
+          <w:sz w:val="22"/>
+        </w:rPr>
+        <w:t>Scenario: Design evaluation for a Code Reviewer Agent</w:t>
+        <w:br/>
+      </w:r>
+    </w:p>
+    <w:p>
+      <w:pPr>
+        <w:spacing w:after="160"/>
+      </w:pPr>
+      <w:r>
+        <w:rPr>
+          <w:b/>
+          <w:color w:val="00B0B0"/>
+        </w:rPr>
+        <w:t>Part 1: Human Evaluation (10 min)</w:t>
+      </w:r>
+      <w:r>
+        <w:br/>
+        <w:t>Read the rubric. Evaluate 3 sample code reviews. Rate on: Relevance, Clarity, Actionability (1-4 scale). Discuss: What makes a good review?</w:t>
+      </w:r>
+    </w:p>
+    <w:p>
+      <w:pPr>
+        <w:spacing w:after="160"/>
+      </w:pPr>
+      <w:r>
+        <w:rPr>
+          <w:b/>
+          <w:color w:val="00B0B0"/>
+        </w:rPr>
+        <w:t>Part 2: Design Automated Checks (15 min)</w:t>
+      </w:r>
+      <w:r>
+        <w:br/>
+        <w:t>Write 2 checks that verify basic quality. Example: Does review suggest at least 1 improvement? You design 2 more.</w:t>
+      </w:r>
+    </w:p>
+    <w:p>
+      <w:pPr>
+        <w:spacing w:after="160"/>
+      </w:pPr>
+      <w:r>
+        <w:rPr>
+          <w:b/>
+          <w:color w:val="00B0B0"/>
+        </w:rPr>
+        <w:t>Part 3: Design Metrics (15 min)</w:t>
+      </w:r>
+      <w:r>
+        <w:br/>
+        <w:t>Pick 3 metrics to track daily. For each: What's the target? Example: % of reviews rated Relevant by humans (target: 85%+)</w:t>
+      </w:r>
+    </w:p>
+    <w:p>
+      <w:pPr>
+        <w:spacing w:after="160"/>
+      </w:pPr>
+      <w:r>
+        <w:rPr>
+          <w:b/>
+          <w:color w:val="00B0B0"/>
+        </w:rPr>
+        <w:t>Part 4: Share &amp; Discuss (5 min)</w:t>
+      </w:r>
+      <w:r>
+        <w:br/>
+        <w:t>Each pair shares 1 check + 1 metric. Group votes: Which are most important?</w:t>
+      </w:r>
+    </w:p>
+    <w:p/>
+    <w:p>
+      <w:pPr>
+        <w:pStyle w:val="Heading1"/>
+        <w:spacing w:before="240" w:after="160"/>
+      </w:pPr>
+      <w:r>
+        <w:rPr>
+          <w:b/>
+          <w:color w:val="1F4E79"/>
+          <w:sz w:val="32"/>
+        </w:rPr>
+        <w:t>Assessment Checkpoints</w:t>
+      </w:r>
+    </w:p>
+    <w:p>
+      <w:pPr>
+        <w:spacing w:after="200"/>
+      </w:pPr>
+      <w:r>
+        <w:rPr>
+          <w:b/>
+          <w:color w:val="1F4E79"/>
+        </w:rPr>
+        <w:t>Checkpoint 1 (0:25): Conceptual Understanding</w:t>
+      </w:r>
+      <w:r>
+        <w:br/>
+        <w:t>Ask: What's the difference between a unit test and evaluation?</w:t>
+        <w:br/>
+        <w:t>Acceptable: Unit test checks code works. Evaluation checks if system achieves its goal.</w:t>
+      </w:r>
+    </w:p>
+    <w:p>
+      <w:pPr>
+        <w:spacing w:after="200"/>
+      </w:pPr>
+      <w:r>
+        <w:rPr>
+          <w:b/>
+          <w:color w:val="1F4E79"/>
+        </w:rPr>
+        <w:t>Checkpoint 2 (0:40): Framework Understanding</w:t>
+      </w:r>
+      <w:r>
+        <w:br/>
+        <w:t>Show code. Ask: What's this checking? Why?</w:t>
+        <w:br/>
+        <w:t>Green flag: They explain both the logic AND the reasoning.</w:t>
+      </w:r>
+    </w:p>
+    <w:p>
+      <w:pPr>
+        <w:spacing w:after="200"/>
+      </w:pPr>
+      <w:r>
+        <w:rPr>
+          <w:b/>
+          <w:color w:val="1F4E79"/>
+        </w:rPr>
+        <w:t>Checkpoint 3 (0:75): Application</w:t>
+      </w:r>
+      <w:r>
+        <w:br/>
+        <w:t>Watch their exercise. Can they write a sensible check or metric?</w:t>
+        <w:br/>
+        <w:t>Green: They ask 'What would a human do first?'</w:t>
+      </w:r>
+    </w:p>
+    <w:p>
+      <w:pPr>
+        <w:spacing w:after="200"/>
+      </w:pPr>
+      <w:r>
+        <w:rPr>
+          <w:b/>
+          <w:color w:val="1F4E79"/>
+        </w:rPr>
+        <w:t>Checkpoint 4 (0:90): Reflection</w:t>
+      </w:r>
+      <w:r>
+        <w:br/>
+        <w:t>Ask: Is evaluation one-time or ongoing?</w:t>
+        <w:br/>
+        <w:t>Acceptable: Ongoing. You measure, improve, measure again.</w:t>
+      </w:r>
+    </w:p>
+    <w:p/>
+    <w:p>
+      <w:pPr>
+        <w:pStyle w:val="Heading1"/>
+        <w:spacing w:before="240" w:after="160"/>
+      </w:pPr>
+      <w:r>
+        <w:rPr>
+          <w:b/>
+          <w:color w:val="1F4E79"/>
+          <w:sz w:val="32"/>
+        </w:rPr>
+        <w:t>Ethical Considerations</w:t>
+      </w:r>
+    </w:p>
+    <w:p>
+      <w:pPr>
+        <w:spacing w:after="200"/>
+      </w:pPr>
+      <w:r>
+        <w:rPr>
+          <w:b/>
+          <w:color w:val="00B0B0"/>
+        </w:rPr>
+        <w:t>E1: Evaluation Encodes Values</w:t>
+      </w:r>
+      <w:r>
+        <w:br/>
+        <w:t>Every metric reflects a value judgment. 'Accuracy' assumes correctness matters most. But speed or empathy might matter more.</w:t>
+        <w:br/>
+        <w:br/>
+        <w:t>In Practice: Name your values explicitly. 'For this system, we prioritize accuracy over speed because...'</w:t>
+      </w:r>
+    </w:p>
+    <w:p>
+      <w:pPr>
+        <w:spacing w:after="200"/>
+      </w:pPr>
+      <w:r>
+        <w:rPr>
+          <w:b/>
+          <w:color w:val="00B0B0"/>
+        </w:rPr>
+        <w:t>E2: Test Sets Are Biased</w:t>
+      </w:r>
+      <w:r>
+        <w:br/>
+        <w:t>Evaluation is only as good as your test data. If test set doesn't include edge cases, minorities, or unusual scenarios, it will miss failures.</w:t>
+        <w:br/>
+        <w:br/>
+        <w:t>In Practice: Stratify test set (80% typical cases, 10% edge cases, 10% underrepresented groups).</w:t>
+      </w:r>
+    </w:p>
+    <w:p>
+      <w:pPr>
+        <w:spacing w:after="200"/>
+      </w:pPr>
+      <w:r>
+        <w:rPr>
+          <w:b/>
+          <w:color w:val="00B0B0"/>
+        </w:rPr>
+        <w:t>E3: Metric Gaming</w:t>
+      </w:r>
+      <w:r>
+        <w:br/>
+        <w:t>If you optimize for a metric, humans will game it. 'Maximize response length' → agent writes novels instead of concise answers.</w:t>
+        <w:br/>
+        <w:br/>
+        <w:t>In Practice: Monitor not just the metric you optimize, but proxy metrics (user satisfaction, latency, cost).</w:t>
+      </w:r>
+    </w:p>
+    <w:p>
+      <w:pPr>
+        <w:spacing w:after="200"/>
+      </w:pPr>
+      <w:r>
+        <w:rPr>
+          <w:b/>
+          <w:color w:val="00B0B0"/>
+        </w:rPr>
+        <w:t>E4: Documentation &amp; Audit Trail</w:t>
+      </w:r>
+      <w:r>
+        <w:br/>
+        <w:t>You decide to pass an agent. Why? If you can't explain, you're not accountable.</w:t>
+        <w:br/>
+        <w:br/>
+        <w:t>In Practice: Log what was measured, why, what the threshold was, who decided, when.</w:t>
+      </w:r>
+    </w:p>
+    <w:p/>
+    <w:p>
+      <w:pPr>
+        <w:pStyle w:val="Heading1"/>
+        <w:spacing w:before="240" w:after="160"/>
+      </w:pPr>
+      <w:r>
+        <w:rPr>
+          <w:b/>
+          <w:color w:val="1F4E79"/>
+          <w:sz w:val="32"/>
+        </w:rPr>
+        <w:t>Resources &amp; Materials</w:t>
+      </w:r>
+    </w:p>
+    <w:p>
+      <w:pPr>
+        <w:spacing w:after="200"/>
       </w:pPr>
       <w:r>
         <w:rPr>
@@ -736,20 +1436,18 @@
           <w:color w:val="1F4E79"/>
           <w:sz w:val="24"/>
         </w:rPr>
-        <w:t>Variant A — Quality Control Analogy (START HERE)</w:t>
+        <w:t>Slides</w:t>
       </w:r>
       <w:r>
         <w:br/>
-        <w:t>Systems evaluation is to agents what quality control is to factories. You build a product (an agent), then you ask: Does it work? Does it meet standards? What breaks? Evaluation answers these questions.</w:t>
+        <w:t>Systems_Evaluations_Instructor_Slides_Final.pptx (12 slides, all concepts)</w:t>
         <w:br/>
-        <w:br/>
-        <w:t>Why it works: Concrete, relatable, anchors abstract concept.</w:t>
+        <w:t>Systems_Evaluations_Instructor_Slides_Final.pdf (shareable version)</w:t>
       </w:r>
     </w:p>
     <w:p>
       <w:pPr>
-        <w:spacing w:after="160"/>
-        <w:ind w:left="432"/>
+        <w:spacing w:after="200"/>
       </w:pPr>
       <w:r>
         <w:rPr>
@@ -757,17 +1455,16 @@
           <w:color w:val="1F4E79"/>
           <w:sz w:val="24"/>
         </w:rPr>
-        <w:t>Variant B — Problem-first</w:t>
+        <w:t>Code Examples</w:t>
       </w:r>
       <w:r>
         <w:br/>
-        <w:t>You've built an agent. But how do you know it's good? Good is subjective. Evaluation answers: Does it generate quality materials? Does it publish without errors? Does it handle edge cases? It's the difference between 'works on my test' and 'works in production'.</w:t>
+        <w:t>All Python examples in this pack are executable. Available in GitHub repository.</w:t>
       </w:r>
     </w:p>
     <w:p>
       <w:pPr>
-        <w:spacing w:after="160"/>
-        <w:ind w:left="432"/>
+        <w:spacing w:after="200"/>
       </w:pPr>
       <w:r>
         <w:rPr>
@@ -775,307 +1472,9 @@
           <w:color w:val="1F4E79"/>
           <w:sz w:val="24"/>
         </w:rPr>
-        <w:t>Variant C — Code-first</w:t>
+        <w:t>Handouts to Print</w:t>
       </w:r>
       <w:r>
-        <w:br/>
-        <w:t>Evaluation is a layer on your agent. Capture inputs → run agent → measure quality → iterate. Measure → find problems → improve → measure again. It's continuous validation.</w:t>
-      </w:r>
-    </w:p>
-    <w:p>
-      <w:pPr>
-        <w:spacing w:after="160"/>
-        <w:ind w:left="432"/>
-      </w:pPr>
-      <w:r>
-        <w:rPr>
-          <w:b/>
-          <w:color w:val="1F4E79"/>
-          <w:sz w:val="24"/>
-        </w:rPr>
-        <w:t>Variant D — Ethical angle</w:t>
-      </w:r>
-      <w:r>
-        <w:br/>
-        <w:t>When you ship an agent, you're responsible. Evaluation means: Is it accurate? Is it fair? Can you explain decisions? Does it handle edge cases? These aren't technical—they're ethical.</w:t>
-      </w:r>
-    </w:p>
-    <w:p/>
-    <w:p>
-      <w:pPr>
-        <w:pStyle w:val="Heading1"/>
-        <w:spacing w:before="240" w:after="120"/>
-      </w:pPr>
-      <w:r>
-        <w:t>Facilitation Notes (How to Lead This)</w:t>
-      </w:r>
-    </w:p>
-    <w:p>
-      <w:pPr>
-        <w:pStyle w:val="Heading2"/>
-        <w:spacing w:before="200" w:after="80"/>
-      </w:pPr>
-      <w:r>
-        <w:t>Warm-up (0:00-0:10): Make It Interactive</w:t>
-      </w:r>
-    </w:p>
-    <w:p>
-      <w:r>
-        <w:br/>
-        <w:t>1. Show a real agent response on screen</w:t>
-        <w:br/>
-        <w:t>2. Ask: "Is this good? Rate it 1-5" (force them to define criteria)</w:t>
-        <w:br/>
-        <w:t>3. Listen: Don't correct. Let them name criteria</w:t>
-        <w:br/>
-        <w:t>4. Synthesize: "You said accurate, concise, complete. Those are your metrics"</w:t>
-        <w:br/>
-        <w:t>5. Insight: "We just did evaluation without knowing it. Now let's formalize"</w:t>
-        <w:br/>
-        <w:br/>
-        <w:t>If they struggle: "Imagine you're a learner. Would you understand this?"</w:t>
-        <w:br/>
-      </w:r>
-    </w:p>
-    <w:p/>
-    <w:p>
-      <w:pPr>
-        <w:pStyle w:val="Heading1"/>
-        <w:spacing w:before="240" w:after="120"/>
-      </w:pPr>
-      <w:r>
-        <w:t>Hands-On Exercise (0:65-0:80)</w:t>
-      </w:r>
-    </w:p>
-    <w:p>
-      <w:r>
-        <w:br/>
-        <w:t>Scenario: Design evaluation for a Code Reviewer Agent</w:t>
-        <w:br/>
-        <w:br/>
-        <w:t>Part 1: Human Evaluation (10 min)</w:t>
-        <w:br/>
-        <w:t>- Read the rubric</w:t>
-        <w:br/>
-        <w:t>- Evaluate 3 sample code reviews</w:t>
-        <w:br/>
-        <w:t>- Rate on: Relevance, Clarity, Actionability (1-4)</w:t>
-        <w:br/>
-        <w:t>- Discuss: What makes a good review?</w:t>
-        <w:br/>
-        <w:br/>
-        <w:t>Part 2: Design Automated Checks (15 min)</w:t>
-        <w:br/>
-        <w:t>- Write 2 checks that verify basic quality</w:t>
-        <w:br/>
-        <w:t>- Example: "Does review suggest at least 1 improvement?"</w:t>
-        <w:br/>
-        <w:t>- You design 2 more</w:t>
-        <w:br/>
-        <w:br/>
-        <w:t>Part 3: Design Metrics (15 min)</w:t>
-        <w:br/>
-        <w:t>- Pick 3 metrics to track daily</w:t>
-        <w:br/>
-        <w:t>- For each: What's the target?</w:t>
-        <w:br/>
-        <w:t>- Example: "% of reviews rated Relevant by humans (target: 85%+)"</w:t>
-        <w:br/>
-        <w:br/>
-        <w:t>Part 4: Share &amp; Discuss (5 min)</w:t>
-        <w:br/>
-        <w:t>- Each pair shares 1 check + 1 metric</w:t>
-        <w:br/>
-        <w:t>- Group votes: Most important?</w:t>
-        <w:br/>
-      </w:r>
-    </w:p>
-    <w:p/>
-    <w:p>
-      <w:pPr>
-        <w:pStyle w:val="Heading1"/>
-        <w:spacing w:before="240" w:after="120"/>
-      </w:pPr>
-      <w:r>
-        <w:t>Assessment Checkpoints</w:t>
-      </w:r>
-    </w:p>
-    <w:p>
-      <w:pPr>
-        <w:pStyle w:val="Heading2"/>
-        <w:spacing w:before="200" w:after="80"/>
-      </w:pPr>
-      <w:r>
-        <w:t>Checkpoint 1 (0:25): Conceptual Understanding</w:t>
-      </w:r>
-    </w:p>
-    <w:p>
-      <w:r>
-        <w:t>Ask: What's the difference between a unit test and an evaluation?</w:t>
-        <w:br/>
-        <w:t>Acceptable: Unit test checks code; evaluation checks if system achieves its goal</w:t>
-      </w:r>
-    </w:p>
-    <w:p>
-      <w:pPr>
-        <w:pStyle w:val="Heading2"/>
-        <w:spacing w:before="200" w:after="80"/>
-      </w:pPr>
-      <w:r>
-        <w:t>Checkpoint 2 (0:40): Framework Understanding</w:t>
-      </w:r>
-    </w:p>
-    <w:p>
-      <w:r>
-        <w:t>Show code. Ask: What's this checking? Why?</w:t>
-        <w:br/>
-        <w:t>Green flag: They can point to logic AND explain reasoning</w:t>
-      </w:r>
-    </w:p>
-    <w:p>
-      <w:pPr>
-        <w:pStyle w:val="Heading2"/>
-        <w:spacing w:before="200" w:after="80"/>
-      </w:pPr>
-      <w:r>
-        <w:t>Checkpoint 3 (0:75): Application</w:t>
-      </w:r>
-    </w:p>
-    <w:p>
-      <w:r>
-        <w:t>Observe exercise: Can they write a sensible check or metric?</w:t>
-        <w:br/>
-        <w:t>Green: They ask 'What would a human do first?' (shows understanding)</w:t>
-      </w:r>
-    </w:p>
-    <w:p>
-      <w:pPr>
-        <w:pStyle w:val="Heading2"/>
-        <w:spacing w:before="200" w:after="80"/>
-      </w:pPr>
-      <w:r>
-        <w:t>Checkpoint 4 (0:90): Reflection</w:t>
-      </w:r>
-    </w:p>
-    <w:p>
-      <w:r>
-        <w:t>Ask: Is evaluation one-time or ongoing?</w:t>
-        <w:br/>
-        <w:t>Acceptable: Ongoing. Measure, improve, measure again</w:t>
-      </w:r>
-    </w:p>
-    <w:p/>
-    <w:p>
-      <w:pPr>
-        <w:pStyle w:val="Heading1"/>
-        <w:spacing w:before="240" w:after="120"/>
-      </w:pPr>
-      <w:r>
-        <w:t>Ethical Considerations (Critical for AI)</w:t>
-      </w:r>
-    </w:p>
-    <w:p>
-      <w:pPr>
-        <w:pStyle w:val="Heading2"/>
-        <w:spacing w:before="200" w:after="80"/>
-      </w:pPr>
-      <w:r>
-        <w:t>E1: Evaluation Encodes Values</w:t>
-      </w:r>
-    </w:p>
-    <w:p>
-      <w:r>
-        <w:t>Every metric reflects values. 'Accuracy' assumes correctness matters most. But speed or empathy might matter more.</w:t>
-        <w:br/>
-        <w:t>In Practice: Name your values explicitly. 'For this system, we prioritize accuracy over speed because...'</w:t>
-      </w:r>
-    </w:p>
-    <w:p>
-      <w:pPr>
-        <w:pStyle w:val="Heading2"/>
-        <w:spacing w:before="200" w:after="80"/>
-      </w:pPr>
-      <w:r>
-        <w:t>E2: Test Sets Are Biased</w:t>
-      </w:r>
-    </w:p>
-    <w:p>
-      <w:r>
-        <w:t>Evaluation is only as good as test data. If test set doesn't include edge cases, minorities, or unusual scenarios, it will miss failures.</w:t>
-        <w:br/>
-        <w:t>In Practice: Stratify test set (80% typical, 10% edge cases, 10% underrepresented groups)</w:t>
-      </w:r>
-    </w:p>
-    <w:p>
-      <w:pPr>
-        <w:pStyle w:val="Heading2"/>
-        <w:spacing w:before="200" w:after="80"/>
-      </w:pPr>
-      <w:r>
-        <w:t>E3: Metric Gaming</w:t>
-      </w:r>
-    </w:p>
-    <w:p>
-      <w:r>
-        <w:t>If you optimize for a metric, humans will game it. Maximize response length → agent writes novels.</w:t>
-        <w:br/>
-        <w:t>In Practice: Monitor not just the metric, but proxy metrics (satisfaction, latency, cost)</w:t>
-      </w:r>
-    </w:p>
-    <w:p>
-      <w:pPr>
-        <w:pStyle w:val="Heading2"/>
-        <w:spacing w:before="200" w:after="80"/>
-      </w:pPr>
-      <w:r>
-        <w:t>E4: Documentation &amp; Audit Trail</w:t>
-      </w:r>
-    </w:p>
-    <w:p>
-      <w:r>
-        <w:t>You decide to pass an agent. Why? If you can't explain, you're not accountable.</w:t>
-        <w:br/>
-        <w:t>In Practice: Log what was measured, why, threshold, who decided, when</w:t>
-      </w:r>
-    </w:p>
-    <w:p>
-      <w:pPr>
-        <w:pStyle w:val="Heading1"/>
-        <w:spacing w:before="240" w:after="120"/>
-      </w:pPr>
-      <w:r>
-        <w:t>Resources &amp; Materials</w:t>
-      </w:r>
-    </w:p>
-    <w:p>
-      <w:r>
-        <w:br/>
-        <w:t>Slides:</w:t>
-        <w:br/>
-        <w:t>• Systems_Evaluations_Instructor_Slides_Final.pptx (12 slides, all concepts)</w:t>
-        <w:br/>
-        <w:t>• Systems_Evaluations_Instructor_Slides_Final.pdf (shareable)</w:t>
-        <w:br/>
-        <w:br/>
-        <w:t>Code Examples:</w:t>
-        <w:br/>
-        <w:t>• All examples in this pack are executable Python</w:t>
-        <w:br/>
-        <w:t>• Available in GitHub repository for copy-paste</w:t>
-        <w:br/>
-        <w:br/>
-        <w:t>Further Reading:</w:t>
-        <w:br/>
-        <w:t>• ACUE: 10 Best Practices for AI Assignments in Higher Ed</w:t>
-        <w:br/>
-        <w:t>• The TPACK Framework Explained</w:t>
-        <w:br/>
-        <w:t>• 7 Scaffolding Learning Strategies for the Classroom</w:t>
-        <w:br/>
-        <w:t>• Pedagogical Content Knowledge</w:t>
-        <w:br/>
-        <w:br/>
-        <w:t>Handouts to Print:</w:t>
         <w:br/>
         <w:t>1. Rubric Guide (1 page)</w:t>
         <w:br/>
@@ -1084,7 +1483,27 @@
         <w:t>3. Check Checklist (1 page)</w:t>
         <w:br/>
         <w:t>4. Ethical Audit (1 page)</w:t>
+      </w:r>
+    </w:p>
+    <w:p>
+      <w:pPr>
+        <w:spacing w:after="200"/>
+      </w:pPr>
+      <w:r>
+        <w:rPr>
+          <w:b/>
+          <w:color w:val="1F4E79"/>
+          <w:sz w:val="24"/>
+        </w:rPr>
+        <w:t>Further Reading</w:t>
+      </w:r>
+      <w:r>
         <w:br/>
+        <w:t>• ACUE: 10 Best Practices for AI Assignments in Higher Ed</w:t>
+        <w:br/>
+        <w:t>• The TPACK Framework Explained</w:t>
+        <w:br/>
+        <w:t>• 7 Scaffolding Learning Strategies for the Classroom</w:t>
       </w:r>
     </w:p>
     <w:p/>
@@ -1095,17 +1514,17 @@
       <w:r>
         <w:rPr>
           <w:i/>
-          <w:color w:val="969696"/>
+          <w:color w:val="616161"/>
           <w:sz w:val="18"/>
         </w:rPr>
-        <w:t>Last Updated: 2026-05-07 | Version: Enhanced with Best Practices (v2.0)</w:t>
+        <w:t>Last Updated: 2026-05-07 | Version: Enhanced (v2.0)</w:t>
         <w:br/>
-        <w:t>Contact: aroma.tahir@taleemabad.com</w:t>
+        <w:t>aroma.tahir@taleemabad.com</w:t>
       </w:r>
     </w:p>
     <w:sectPr>
       <w:pgSz w:w="12240" w:h="15840"/>
-      <w:pgMar w:top="1440" w:right="1800" w:bottom="1440" w:left="1800" w:header="720" w:footer="720" w:gutter="0"/>
+      <w:pgMar w:top="1080" w:right="1080" w:bottom="1080" w:left="1080" w:header="720" w:footer="720" w:gutter="0"/>
       <w:cols w:space="720"/>
       <w:docGrid w:linePitch="360"/>
     </w:sectPr>
@@ -1476,10 +1895,6 @@
     <w:name w:val="Normal"/>
     <w:qFormat/>
     <w:rsid w:val="00FC693F"/>
-    <w:rPr>
-      <w:rFonts w:ascii="Calibri" w:hAnsi="Calibri"/>
-      <w:sz w:val="22"/>
-    </w:rPr>
   </w:style>
   <w:style w:type="paragraph" w:styleId="Header">
     <w:name w:val="header"/>

</xml_diff>